<commit_message>
Add paper figures, workflow diagram, and figure generation scripts
- Add results/figures/: performance analysis (per-fold MRR, box plot,
  Wilcoxon test) and workflow diagram figures (PDF)
- Add scripts/generate_figures.py: generates 3-panel performance figure
- Add scripts/generate_workflow.py: generates Simple Ensemble + Path-Gated
  workflow diagram
- Add docs/fig_workflow.tex: TikZ source for workflow diagram
- Update docs/revision_progress_update.docx with full results and status
- Update results/full_results.md
- Update .gitignore to include results/figures/ PDFs
</commit_message>
<xml_diff>
--- a/docs/revision_progress_update.docx
+++ b/docs/revision_progress_update.docx
@@ -4,241 +4,47 @@
   <w:body>
     <w:p>
       <w:pPr>
-        <w:pStyle w:val="Heading1"/>
+        <w:pStyle w:val="Title"/>
+        <w:jc w:val="center"/>
       </w:pPr>
       <w:r>
-        <w:t>WeightedKgBlend — Revision Progress Update</w:t>
+        <w:t>WeightedKgBlend: Revision Progress Update</w:t>
       </w:r>
     </w:p>
     <w:p>
       <w:r>
-        <w:rPr>
-          <w:b w:val="0"/>
-          <w:sz w:val="21"/>
-        </w:rPr>
-        <w:t>Meghamala Sinha  |  April 2025</w:t>
-      </w:r>
-    </w:p>
-    <w:p/>
-    <w:p>
-      <w:pPr>
-        <w:pStyle w:val="Heading2"/>
-      </w:pPr>
-      <w:r>
-        <w:t>Overview</w:t>
+        <w:t>Meghamala Sinha, Roger Tu, Carolina González, Andrew I. Su</w:t>
       </w:r>
     </w:p>
     <w:p>
       <w:r>
-        <w:rPr>
-          <w:b w:val="0"/>
-          <w:sz w:val="21"/>
-        </w:rPr>
-        <w:t>All reviewer comments are addressed. Several additional contributions significantly strengthen the paper, including a novel Path-Gated Re-ranking method and repurposing candidate analysis.</w:t>
+        <w:t>The Scripps Research Institute | May 2026</w:t>
+      </w:r>
+    </w:p>
+    <w:p>
+      <w:r>
+        <w:t>bioRxiv: https://doi.org/10.1101/2024.07.16.603664</w:t>
       </w:r>
     </w:p>
     <w:p>
       <w:pPr>
-        <w:pStyle w:val="Heading2"/>
+        <w:pStyle w:val="Heading1"/>
       </w:pPr>
       <w:r>
-        <w:t>Reviewer 1</w:t>
+        <w:t>1. Overview</w:t>
       </w:r>
     </w:p>
     <w:p>
       <w:r>
-        <w:rPr>
-          <w:b/>
-          <w:sz w:val="21"/>
-        </w:rPr>
-        <w:t>R1.1 — Justification for indication-only evaluation</w:t>
-      </w:r>
-    </w:p>
-    <w:p>
-      <w:r>
-        <w:rPr>
-          <w:b w:val="0"/>
-          <w:sz w:val="21"/>
-        </w:rPr>
-        <w:t>FDA-approved indications are the highest-confidence gold standard, requiring clinical trial evidence before regulatory approval. A justification paragraph citing DrugCentral has been added to Methods.</w:t>
-      </w:r>
-    </w:p>
-    <w:p>
-      <w:r>
-        <w:rPr>
-          <w:b/>
-          <w:sz w:val="21"/>
-        </w:rPr>
-        <w:t>R1.2 — Arbitrary splits / no variability estimate</w:t>
-      </w:r>
-    </w:p>
-    <w:p>
-      <w:r>
-        <w:rPr>
-          <w:b w:val="0"/>
-          <w:sz w:val="21"/>
-        </w:rPr>
-        <w:t>Addressed with 5-fold cross-validation (fixed seeds). Metrics reported as mean ± std across folds. Wilcoxon signed-rank test confirms WeightedKgBlend significantly outperforms all individual models (p &lt; 0.05).</w:t>
-      </w:r>
-    </w:p>
-    <w:p>
-      <w:r>
-        <w:rPr>
-          <w:b/>
-          <w:sz w:val="21"/>
-        </w:rPr>
-        <w:t>R1.3 — Computational complexity</w:t>
-      </w:r>
-    </w:p>
-    <w:p>
-      <w:r>
-        <w:rPr>
-          <w:b w:val="0"/>
-          <w:sz w:val="21"/>
-        </w:rPr>
-        <w:t>Runtime table added to Results with wall-clock training and inference times per method. SHAP-based model importance scores show each model's contribution to the ensemble.</w:t>
-      </w:r>
-    </w:p>
-    <w:p>
-      <w:r>
-        <w:rPr>
-          <w:b/>
-          <w:sz w:val="21"/>
-        </w:rPr>
-        <w:t>R1.4 — Hits@10 drops vs TransE</w:t>
-      </w:r>
-    </w:p>
-    <w:p>
-      <w:r>
-        <w:rPr>
-          <w:b w:val="0"/>
-          <w:sz w:val="21"/>
-        </w:rPr>
-        <w:t>Added Discussion paragraph: the ensemble optimises for MRR (precision at top ranks), while TransE spreads probability mass broadly for higher Hits@10. For clinical repurposing, top-rank precision is more valuable.</w:t>
-      </w:r>
-    </w:p>
-    <w:p>
-      <w:r>
-        <w:rPr>
-          <w:b/>
-          <w:sz w:val="21"/>
-        </w:rPr>
-        <w:t>R1.5 — No statistical significance testing</w:t>
-      </w:r>
-    </w:p>
-    <w:p>
-      <w:r>
-        <w:rPr>
-          <w:b w:val="0"/>
-          <w:sz w:val="21"/>
-        </w:rPr>
-        <w:t>Wilcoxon signed-rank tests performed across all 5 folds. All comparisons significant (p &lt; 0.05), reported in Table 1.</w:t>
-      </w:r>
-    </w:p>
-    <w:p>
-      <w:r>
-        <w:rPr>
-          <w:b/>
-          <w:sz w:val="21"/>
-        </w:rPr>
-        <w:t>R1.6 — Ensemble too simple</w:t>
-      </w:r>
-    </w:p>
-    <w:p>
-      <w:r>
-        <w:rPr>
-          <w:b w:val="0"/>
-          <w:sz w:val="21"/>
-        </w:rPr>
-        <w:t>Ensemble uses Optuna Bayesian optimisation (300 trials, TPE sampler) over linear weights, maximising validation MRR. Principled and reproducible without overfitting risk.</w:t>
-      </w:r>
-    </w:p>
-    <w:p>
-      <w:r>
-        <w:rPr>
-          <w:b/>
-          <w:sz w:val="21"/>
-        </w:rPr>
-        <w:t>R1.6+ — Novel: Path-Gated Re-ranking</w:t>
-      </w:r>
-    </w:p>
-    <w:p>
-      <w:r>
-        <w:rPr>
-          <w:b w:val="0"/>
-          <w:sz w:val="21"/>
-        </w:rPr>
-        <w:t>Two-stage method: RotatE generates top-50 candidates, ProbCBR mechanistic paths re-rank them. Score = α×(1/RotatE_rank) + β×path_score, weights tuned via Optuna. Path coverage improved from 7.5% → 41.1%. Slice_0: MRR +14%, Hits@10 +47%. Every prediction includes a mechanistic biological path.</w:t>
-      </w:r>
-    </w:p>
-    <w:p>
-      <w:r>
-        <w:rPr>
-          <w:b/>
-          <w:sz w:val="21"/>
-        </w:rPr>
-        <w:t>R1.7 — Hyperparameter selection</w:t>
-      </w:r>
-    </w:p>
-    <w:p>
-      <w:r>
-        <w:rPr>
-          <w:b w:val="0"/>
-          <w:sz w:val="21"/>
-        </w:rPr>
-        <w:t>Dedicated Hyperparameter Selection section added to Methods. All parameters in config.yaml. KGE: PyKEEN defaults with early stopping. Ensemble: Optuna TPE, 300 trials.</w:t>
+        <w:t>WeightedKgBlend is a weighted ensemble method for link prediction in biomedical knowledge graphs, combining Knowledge Graph Embedding (KGE) methods with Case-Based Reasoning (CBR) for drug-disease association prediction and drug repurposing. Evaluated on an updated MIND dataset with 6,761 indication edges.</w:t>
       </w:r>
     </w:p>
     <w:p>
       <w:pPr>
-        <w:pStyle w:val="Heading2"/>
+        <w:pStyle w:val="Heading1"/>
       </w:pPr>
       <w:r>
-        <w:t>Reviewer 2</w:t>
-      </w:r>
-    </w:p>
-    <w:p>
-      <w:r>
-        <w:rPr>
-          <w:b/>
-          <w:sz w:val="21"/>
-        </w:rPr>
-        <w:t>R2.1 — Novelty</w:t>
-      </w:r>
-    </w:p>
-    <w:p>
-      <w:r>
-        <w:rPr>
-          <w:b w:val="0"/>
-          <w:sz w:val="21"/>
-        </w:rPr>
-        <w:t>Novelty reframed around: (1) first KGE + path-based ensemble on large biomedical KG, (2) novel Path-Gated Re-ranking with mechanistic paths for every prediction, (3) updated MIND dataset (+2,763 indication edges). Introduction revised accordingly.</w:t>
-      </w:r>
-    </w:p>
-    <w:p>
-      <w:r>
-        <w:rPr>
-          <w:b/>
-          <w:sz w:val="21"/>
-        </w:rPr>
-        <w:t>R2.2 — Not state-of-the-art</w:t>
-      </w:r>
-    </w:p>
-    <w:p>
-      <w:r>
-        <w:rPr>
-          <w:b w:val="0"/>
-          <w:sz w:val="21"/>
-        </w:rPr>
-        <w:t>Related Work section added covering XG4Repo, BioPathNet, TxGNN, K-Paths (2024–2025). WeightedKgBlend positioned as a rigorous benchmark and interpretability-focused approach. AnyBURL added as 8th rule-based baseline.</w:t>
-      </w:r>
-    </w:p>
-    <w:p>
-      <w:pPr>
-        <w:pStyle w:val="Heading2"/>
-      </w:pPr>
-      <w:r>
-        <w:t>Additional Contributions</w:t>
+        <w:t>2. Key Contributions Completed</w:t>
       </w:r>
     </w:p>
     <w:p>
@@ -246,17 +52,7 @@
         <w:pStyle w:val="ListBullet"/>
       </w:pPr>
       <w:r>
-        <w:rPr>
-          <w:b/>
-          <w:sz w:val="21"/>
-        </w:rPr>
-        <w:t xml:space="preserve">Updated MIND Dataset — </w:t>
-      </w:r>
-      <w:r>
-        <w:rPr>
-          <w:sz w:val="21"/>
-        </w:rPr>
-        <w:t>2,763 new FDA-approved indication edges (8,133 total, +51%) via systematic DrugCentral re-mapping.</w:t>
+        <w:t>Updated MIND dataset (splits_updated): Added 1,391 new FDA-approved indication edges from DrugCentral via DrugCentral→MeSH→DOID remapping pipeline. Total: 6,761 indication edges.</w:t>
       </w:r>
     </w:p>
     <w:p>
@@ -264,17 +60,7 @@
         <w:pStyle w:val="ListBullet"/>
       </w:pPr>
       <w:r>
-        <w:rPr>
-          <w:b/>
-          <w:sz w:val="21"/>
-        </w:rPr>
-        <w:t xml:space="preserve">Mechanistic Path Extraction — </w:t>
-      </w:r>
-      <w:r>
-        <w:rPr>
-          <w:sz w:val="21"/>
-        </w:rPr>
-        <w:t>Quality-ranked paths for every prediction enable biological interpretation of all top candidates.</w:t>
+        <w:t>5-fold cross-validation: Stratified splits with 676 test/valid edges per fold across 5 slices.</w:t>
       </w:r>
     </w:p>
     <w:p>
@@ -282,17 +68,7 @@
         <w:pStyle w:val="ListBullet"/>
       </w:pPr>
       <w:r>
-        <w:rPr>
-          <w:b/>
-          <w:sz w:val="21"/>
-        </w:rPr>
-        <w:t xml:space="preserve">Path-Gated Re-ranking — </w:t>
-      </w:r>
-      <w:r>
-        <w:rPr>
-          <w:sz w:val="21"/>
-        </w:rPr>
-        <w:t>Novel two-stage method. MRR +14%, Hits@10 +47% on slice_0. Every prediction has a mechanistic path.</w:t>
+        <w:t>KGE models (TransE, RotatE): Trained and evaluated on all 5 slices using PyKEEN on Kaggle GPU.</w:t>
       </w:r>
     </w:p>
     <w:p>
@@ -300,17 +76,7 @@
         <w:pStyle w:val="ListBullet"/>
       </w:pPr>
       <w:r>
-        <w:rPr>
-          <w:b/>
-          <w:sz w:val="21"/>
-        </w:rPr>
-        <w:t xml:space="preserve">Novel Repurposing Candidates — </w:t>
-      </w:r>
-      <w:r>
-        <w:rPr>
-          <w:sz w:val="21"/>
-        </w:rPr>
-        <w:t>Evidence-tiered candidates (rank ≤5/10/20 + path). Top picks: cabozantinib→neuroblastoma, topiramate→bipolar disorder, pomalidomide→MDS.</w:t>
+        <w:t>ProbCBR (path-based reasoning): Implemented and evaluated on all 5 slices.</w:t>
       </w:r>
     </w:p>
     <w:p>
@@ -318,17 +84,7 @@
         <w:pStyle w:val="ListBullet"/>
       </w:pPr>
       <w:r>
-        <w:rPr>
-          <w:b/>
-          <w:sz w:val="21"/>
-        </w:rPr>
-        <w:t xml:space="preserve">GitHub &amp; Reproducibility — </w:t>
-      </w:r>
-      <w:r>
-        <w:rPr>
-          <w:sz w:val="21"/>
-        </w:rPr>
-        <w:t>Full pipeline at github.com/meghasin/WeightedKgBlend with config, scripts, and split generation.</w:t>
+        <w:t>Simple Ensemble: Optuna-tuned weighted combination of TransE + RotatE + ProbCBR reciprocal ranks. Evaluated on all 5 slices.</w:t>
       </w:r>
     </w:p>
     <w:p>
@@ -336,25 +92,1911 @@
         <w:pStyle w:val="ListBullet"/>
       </w:pPr>
       <w:r>
-        <w:rPr>
-          <w:b/>
-          <w:sz w:val="21"/>
-        </w:rPr>
-        <w:t xml:space="preserve">Literature Positioning — </w:t>
-      </w:r>
-      <w:r>
-        <w:rPr>
-          <w:sz w:val="21"/>
-        </w:rPr>
-        <w:t>Comprehensive 2024–2025 related work section added.</w:t>
+        <w:t>Path-Gated Re-ranking (novel): Two-stage method — RotatE for candidate generation, ProbCBR paths for re-ranking. Best method across all slices.</w:t>
       </w:r>
     </w:p>
     <w:p>
       <w:pPr>
-        <w:pStyle w:val="Heading2"/>
+        <w:pStyle w:val="ListBullet"/>
       </w:pPr>
       <w:r>
-        <w:t>Slice_0 Results (preliminary)</w:t>
+        <w:t>Drug repurposing candidates: 455 high-confidence candidates (rank ≤ 5) with mechanistic 2-hop paths; 30 fully resolved with drug/disease names.</w:t>
+      </w:r>
+    </w:p>
+    <w:p>
+      <w:pPr>
+        <w:pStyle w:val="ListBullet"/>
+      </w:pPr>
+      <w:r>
+        <w:t>ULTRA follow-up (NeuralPathReasoning-MIND): Zero-shot ULTRA achieves MRR 0.3569±0.0092 — 5.2× improvement over Path-Gated with no fine-tuning.</w:t>
+      </w:r>
+    </w:p>
+    <w:p>
+      <w:pPr>
+        <w:pStyle w:val="Heading1"/>
+      </w:pPr>
+      <w:r>
+        <w:t>3. Dataset: MIND splits_updated</w:t>
+      </w:r>
+    </w:p>
+    <w:p>
+      <w:r>
+        <w:t>Available on Zenodo (DOI: 10.5281/zenodo.8117748) and Kaggle (megha90/wkb-splits-updated).</w:t>
+      </w:r>
+    </w:p>
+    <w:tbl>
+      <w:tblPr>
+        <w:tblStyle w:val="TableGrid"/>
+        <w:tblW w:type="auto" w:w="0"/>
+        <w:tblLook w:firstColumn="1" w:firstRow="1" w:lastColumn="0" w:lastRow="0" w:noHBand="0" w:noVBand="1" w:val="04A0"/>
+      </w:tblPr>
+      <w:tblGrid>
+        <w:gridCol w:w="4320"/>
+        <w:gridCol w:w="4320"/>
+      </w:tblGrid>
+      <w:tr>
+        <w:tc>
+          <w:tcPr>
+            <w:tcW w:type="dxa" w:w="4320"/>
+          </w:tcPr>
+          <w:p>
+            <w:r>
+              <w:t>Property</w:t>
+            </w:r>
+          </w:p>
+        </w:tc>
+        <w:tc>
+          <w:tcPr>
+            <w:tcW w:type="dxa" w:w="4320"/>
+          </w:tcPr>
+          <w:p>
+            <w:r>
+              <w:t>Value</w:t>
+            </w:r>
+          </w:p>
+        </w:tc>
+      </w:tr>
+      <w:tr>
+        <w:tc>
+          <w:tcPr>
+            <w:tcW w:type="dxa" w:w="4320"/>
+          </w:tcPr>
+          <w:p>
+            <w:r>
+              <w:t>Total edges</w:t>
+            </w:r>
+          </w:p>
+        </w:tc>
+        <w:tc>
+          <w:tcPr>
+            <w:tcW w:type="dxa" w:w="4320"/>
+          </w:tcPr>
+          <w:p>
+            <w:r>
+              <w:t>9,652,116</w:t>
+            </w:r>
+          </w:p>
+        </w:tc>
+      </w:tr>
+      <w:tr>
+        <w:tc>
+          <w:tcPr>
+            <w:tcW w:type="dxa" w:w="4320"/>
+          </w:tcPr>
+          <w:p>
+            <w:r>
+              <w:t>Total nodes</w:t>
+            </w:r>
+          </w:p>
+        </w:tc>
+        <w:tc>
+          <w:tcPr>
+            <w:tcW w:type="dxa" w:w="4320"/>
+          </w:tcPr>
+          <w:p>
+            <w:r>
+              <w:t>250,035</w:t>
+            </w:r>
+          </w:p>
+        </w:tc>
+      </w:tr>
+      <w:tr>
+        <w:tc>
+          <w:tcPr>
+            <w:tcW w:type="dxa" w:w="4320"/>
+          </w:tcPr>
+          <w:p>
+            <w:r>
+              <w:t>Node types</w:t>
+            </w:r>
+          </w:p>
+        </w:tc>
+        <w:tc>
+          <w:tcPr>
+            <w:tcW w:type="dxa" w:w="4320"/>
+          </w:tcPr>
+          <w:p>
+            <w:r>
+              <w:t>9</w:t>
+            </w:r>
+          </w:p>
+        </w:tc>
+      </w:tr>
+      <w:tr>
+        <w:tc>
+          <w:tcPr>
+            <w:tcW w:type="dxa" w:w="4320"/>
+          </w:tcPr>
+          <w:p>
+            <w:r>
+              <w:t>Relation types</w:t>
+            </w:r>
+          </w:p>
+        </w:tc>
+        <w:tc>
+          <w:tcPr>
+            <w:tcW w:type="dxa" w:w="4320"/>
+          </w:tcPr>
+          <w:p>
+            <w:r>
+              <w:t>22</w:t>
+            </w:r>
+          </w:p>
+        </w:tc>
+      </w:tr>
+      <w:tr>
+        <w:tc>
+          <w:tcPr>
+            <w:tcW w:type="dxa" w:w="4320"/>
+          </w:tcPr>
+          <w:p>
+            <w:r>
+              <w:t>Indication edges (updated)</w:t>
+            </w:r>
+          </w:p>
+        </w:tc>
+        <w:tc>
+          <w:tcPr>
+            <w:tcW w:type="dxa" w:w="4320"/>
+          </w:tcPr>
+          <w:p>
+            <w:r>
+              <w:t>6,761</w:t>
+            </w:r>
+          </w:p>
+        </w:tc>
+      </w:tr>
+      <w:tr>
+        <w:tc>
+          <w:tcPr>
+            <w:tcW w:type="dxa" w:w="4320"/>
+          </w:tcPr>
+          <w:p>
+            <w:r>
+              <w:t>Test / valid edges per slice</w:t>
+            </w:r>
+          </w:p>
+        </w:tc>
+        <w:tc>
+          <w:tcPr>
+            <w:tcW w:type="dxa" w:w="4320"/>
+          </w:tcPr>
+          <w:p>
+            <w:r>
+              <w:t>676</w:t>
+            </w:r>
+          </w:p>
+        </w:tc>
+      </w:tr>
+      <w:tr>
+        <w:tc>
+          <w:tcPr>
+            <w:tcW w:type="dxa" w:w="4320"/>
+          </w:tcPr>
+          <w:p>
+            <w:r>
+              <w:t>Cross-validation folds</w:t>
+            </w:r>
+          </w:p>
+        </w:tc>
+        <w:tc>
+          <w:tcPr>
+            <w:tcW w:type="dxa" w:w="4320"/>
+          </w:tcPr>
+          <w:p>
+            <w:r>
+              <w:t>5 (stratified)</w:t>
+            </w:r>
+          </w:p>
+        </w:tc>
+      </w:tr>
+      <w:tr>
+        <w:tc>
+          <w:tcPr>
+            <w:tcW w:type="dxa" w:w="4320"/>
+          </w:tcPr>
+          <w:p>
+            <w:r>
+              <w:t>New DrugCentral edges added</w:t>
+            </w:r>
+          </w:p>
+        </w:tc>
+        <w:tc>
+          <w:tcPr>
+            <w:tcW w:type="dxa" w:w="4320"/>
+          </w:tcPr>
+          <w:p>
+            <w:r>
+              <w:t>1,391</w:t>
+            </w:r>
+          </w:p>
+        </w:tc>
+      </w:tr>
+    </w:tbl>
+    <w:p>
+      <w:pPr>
+        <w:pStyle w:val="Heading1"/>
+      </w:pPr>
+      <w:r>
+        <w:t>4. Results — Test Set (mean ± std across 5 slices)</w:t>
+      </w:r>
+    </w:p>
+    <w:tbl>
+      <w:tblPr>
+        <w:tblStyle w:val="TableGrid"/>
+        <w:tblW w:type="auto" w:w="0"/>
+        <w:tblLook w:firstColumn="1" w:firstRow="1" w:lastColumn="0" w:lastRow="0" w:noHBand="0" w:noVBand="1" w:val="04A0"/>
+      </w:tblPr>
+      <w:tblGrid>
+        <w:gridCol w:w="1440"/>
+        <w:gridCol w:w="1440"/>
+        <w:gridCol w:w="1440"/>
+        <w:gridCol w:w="1440"/>
+        <w:gridCol w:w="1440"/>
+        <w:gridCol w:w="1440"/>
+      </w:tblGrid>
+      <w:tr>
+        <w:tc>
+          <w:tcPr>
+            <w:tcW w:type="dxa" w:w="1440"/>
+          </w:tcPr>
+          <w:p>
+            <w:r>
+              <w:t>Model</w:t>
+            </w:r>
+          </w:p>
+        </w:tc>
+        <w:tc>
+          <w:tcPr>
+            <w:tcW w:type="dxa" w:w="1440"/>
+          </w:tcPr>
+          <w:p>
+            <w:r>
+              <w:t>MRR</w:t>
+            </w:r>
+          </w:p>
+        </w:tc>
+        <w:tc>
+          <w:tcPr>
+            <w:tcW w:type="dxa" w:w="1440"/>
+          </w:tcPr>
+          <w:p>
+            <w:r>
+              <w:t>Hits@1</w:t>
+            </w:r>
+          </w:p>
+        </w:tc>
+        <w:tc>
+          <w:tcPr>
+            <w:tcW w:type="dxa" w:w="1440"/>
+          </w:tcPr>
+          <w:p>
+            <w:r>
+              <w:t>Hits@3</w:t>
+            </w:r>
+          </w:p>
+        </w:tc>
+        <w:tc>
+          <w:tcPr>
+            <w:tcW w:type="dxa" w:w="1440"/>
+          </w:tcPr>
+          <w:p>
+            <w:r>
+              <w:t>Hits@5</w:t>
+            </w:r>
+          </w:p>
+        </w:tc>
+        <w:tc>
+          <w:tcPr>
+            <w:tcW w:type="dxa" w:w="1440"/>
+          </w:tcPr>
+          <w:p>
+            <w:r>
+              <w:t>Hits@10</w:t>
+            </w:r>
+          </w:p>
+        </w:tc>
+      </w:tr>
+      <w:tr>
+        <w:tc>
+          <w:tcPr>
+            <w:tcW w:type="dxa" w:w="1440"/>
+          </w:tcPr>
+          <w:p>
+            <w:r>
+              <w:t>TransE</w:t>
+            </w:r>
+          </w:p>
+        </w:tc>
+        <w:tc>
+          <w:tcPr>
+            <w:tcW w:type="dxa" w:w="1440"/>
+          </w:tcPr>
+          <w:p>
+            <w:r>
+              <w:t>0.0158 ± 0.0025</w:t>
+            </w:r>
+          </w:p>
+        </w:tc>
+        <w:tc>
+          <w:tcPr>
+            <w:tcW w:type="dxa" w:w="1440"/>
+          </w:tcPr>
+          <w:p>
+            <w:r>
+              <w:t>0.0036 ± 0.0015</w:t>
+            </w:r>
+          </w:p>
+        </w:tc>
+        <w:tc>
+          <w:tcPr>
+            <w:tcW w:type="dxa" w:w="1440"/>
+          </w:tcPr>
+          <w:p>
+            <w:r>
+              <w:t>0.0114 ± 0.0039</w:t>
+            </w:r>
+          </w:p>
+        </w:tc>
+        <w:tc>
+          <w:tcPr>
+            <w:tcW w:type="dxa" w:w="1440"/>
+          </w:tcPr>
+          <w:p>
+            <w:r>
+              <w:t>0.0191 ± 0.0042</w:t>
+            </w:r>
+          </w:p>
+        </w:tc>
+        <w:tc>
+          <w:tcPr>
+            <w:tcW w:type="dxa" w:w="1440"/>
+          </w:tcPr>
+          <w:p>
+            <w:r>
+              <w:t>0.0311 ± 0.0080</w:t>
+            </w:r>
+          </w:p>
+        </w:tc>
+      </w:tr>
+      <w:tr>
+        <w:tc>
+          <w:tcPr>
+            <w:tcW w:type="dxa" w:w="1440"/>
+          </w:tcPr>
+          <w:p>
+            <w:r>
+              <w:t>ProbCBR</w:t>
+            </w:r>
+          </w:p>
+        </w:tc>
+        <w:tc>
+          <w:tcPr>
+            <w:tcW w:type="dxa" w:w="1440"/>
+          </w:tcPr>
+          <w:p>
+            <w:r>
+              <w:t>0.0138 ± 0.0061</w:t>
+            </w:r>
+          </w:p>
+        </w:tc>
+        <w:tc>
+          <w:tcPr>
+            <w:tcW w:type="dxa" w:w="1440"/>
+          </w:tcPr>
+          <w:p>
+            <w:r>
+              <w:t>0.0050 ± 0.0052</w:t>
+            </w:r>
+          </w:p>
+        </w:tc>
+        <w:tc>
+          <w:tcPr>
+            <w:tcW w:type="dxa" w:w="1440"/>
+          </w:tcPr>
+          <w:p>
+            <w:r>
+              <w:t>0.0136 ± 0.0058</w:t>
+            </w:r>
+          </w:p>
+        </w:tc>
+        <w:tc>
+          <w:tcPr>
+            <w:tcW w:type="dxa" w:w="1440"/>
+          </w:tcPr>
+          <w:p>
+            <w:r>
+              <w:t>0.0198 ± 0.0079</w:t>
+            </w:r>
+          </w:p>
+        </w:tc>
+        <w:tc>
+          <w:tcPr>
+            <w:tcW w:type="dxa" w:w="1440"/>
+          </w:tcPr>
+          <w:p>
+            <w:r>
+              <w:t>0.0296 ± 0.0091</w:t>
+            </w:r>
+          </w:p>
+        </w:tc>
+      </w:tr>
+      <w:tr>
+        <w:tc>
+          <w:tcPr>
+            <w:tcW w:type="dxa" w:w="1440"/>
+          </w:tcPr>
+          <w:p>
+            <w:r>
+              <w:t>RotatE</w:t>
+            </w:r>
+          </w:p>
+        </w:tc>
+        <w:tc>
+          <w:tcPr>
+            <w:tcW w:type="dxa" w:w="1440"/>
+          </w:tcPr>
+          <w:p>
+            <w:r>
+              <w:t>0.0460 ± 0.0069</w:t>
+            </w:r>
+          </w:p>
+        </w:tc>
+        <w:tc>
+          <w:tcPr>
+            <w:tcW w:type="dxa" w:w="1440"/>
+          </w:tcPr>
+          <w:p>
+            <w:r>
+              <w:t>0.0135 ± 0.0036</w:t>
+            </w:r>
+          </w:p>
+        </w:tc>
+        <w:tc>
+          <w:tcPr>
+            <w:tcW w:type="dxa" w:w="1440"/>
+          </w:tcPr>
+          <w:p>
+            <w:r>
+              <w:t>0.0403 ± 0.0054</w:t>
+            </w:r>
+          </w:p>
+        </w:tc>
+        <w:tc>
+          <w:tcPr>
+            <w:tcW w:type="dxa" w:w="1440"/>
+          </w:tcPr>
+          <w:p>
+            <w:r>
+              <w:t>0.0648 ± 0.0129</w:t>
+            </w:r>
+          </w:p>
+        </w:tc>
+        <w:tc>
+          <w:tcPr>
+            <w:tcW w:type="dxa" w:w="1440"/>
+          </w:tcPr>
+          <w:p>
+            <w:r>
+              <w:t>0.1100 ± 0.0225</w:t>
+            </w:r>
+          </w:p>
+        </w:tc>
+      </w:tr>
+      <w:tr>
+        <w:tc>
+          <w:tcPr>
+            <w:tcW w:type="dxa" w:w="1440"/>
+          </w:tcPr>
+          <w:p>
+            <w:r>
+              <w:t>Simple Ensemble</w:t>
+            </w:r>
+          </w:p>
+        </w:tc>
+        <w:tc>
+          <w:tcPr>
+            <w:tcW w:type="dxa" w:w="1440"/>
+          </w:tcPr>
+          <w:p>
+            <w:r>
+              <w:t>0.0489 ± 0.0068</w:t>
+            </w:r>
+          </w:p>
+        </w:tc>
+        <w:tc>
+          <w:tcPr>
+            <w:tcW w:type="dxa" w:w="1440"/>
+          </w:tcPr>
+          <w:p>
+            <w:r>
+              <w:t>0.0135 ± 0.0036</w:t>
+            </w:r>
+          </w:p>
+        </w:tc>
+        <w:tc>
+          <w:tcPr>
+            <w:tcW w:type="dxa" w:w="1440"/>
+          </w:tcPr>
+          <w:p>
+            <w:r>
+              <w:t>0.0400 ± 0.0052</w:t>
+            </w:r>
+          </w:p>
+        </w:tc>
+        <w:tc>
+          <w:tcPr>
+            <w:tcW w:type="dxa" w:w="1440"/>
+          </w:tcPr>
+          <w:p>
+            <w:r>
+              <w:t>0.0645 ± 0.0130</w:t>
+            </w:r>
+          </w:p>
+        </w:tc>
+        <w:tc>
+          <w:tcPr>
+            <w:tcW w:type="dxa" w:w="1440"/>
+          </w:tcPr>
+          <w:p>
+            <w:r>
+              <w:t>0.1097 ± 0.0225</w:t>
+            </w:r>
+          </w:p>
+        </w:tc>
+      </w:tr>
+      <w:tr>
+        <w:tc>
+          <w:tcPr>
+            <w:tcW w:type="dxa" w:w="1440"/>
+          </w:tcPr>
+          <w:p>
+            <w:r>
+              <w:t>Path-Gated</w:t>
+            </w:r>
+          </w:p>
+        </w:tc>
+        <w:tc>
+          <w:tcPr>
+            <w:tcW w:type="dxa" w:w="1440"/>
+          </w:tcPr>
+          <w:p>
+            <w:r>
+              <w:t>0.0682 ± 0.0107</w:t>
+            </w:r>
+          </w:p>
+        </w:tc>
+        <w:tc>
+          <w:tcPr>
+            <w:tcW w:type="dxa" w:w="1440"/>
+          </w:tcPr>
+          <w:p>
+            <w:r>
+              <w:t>0.0188 ± 0.0073</w:t>
+            </w:r>
+          </w:p>
+        </w:tc>
+        <w:tc>
+          <w:tcPr>
+            <w:tcW w:type="dxa" w:w="1440"/>
+          </w:tcPr>
+          <w:p>
+            <w:r>
+              <w:t>0.0493 ± 0.0131</w:t>
+            </w:r>
+          </w:p>
+        </w:tc>
+        <w:tc>
+          <w:tcPr>
+            <w:tcW w:type="dxa" w:w="1440"/>
+          </w:tcPr>
+          <w:p>
+            <w:r>
+              <w:t>0.0734 ± 0.0188</w:t>
+            </w:r>
+          </w:p>
+        </w:tc>
+        <w:tc>
+          <w:tcPr>
+            <w:tcW w:type="dxa" w:w="1440"/>
+          </w:tcPr>
+          <w:p>
+            <w:r>
+              <w:t>0.1291 ± 0.0263</w:t>
+            </w:r>
+          </w:p>
+        </w:tc>
+      </w:tr>
+    </w:tbl>
+    <w:p>
+      <w:pPr>
+        <w:pStyle w:val="Heading1"/>
+      </w:pPr>
+      <w:r>
+        <w:t>5. Results — Validation Set (mean ± std across 5 slices)</w:t>
+      </w:r>
+    </w:p>
+    <w:tbl>
+      <w:tblPr>
+        <w:tblStyle w:val="TableGrid"/>
+        <w:tblW w:type="auto" w:w="0"/>
+        <w:tblLook w:firstColumn="1" w:firstRow="1" w:lastColumn="0" w:lastRow="0" w:noHBand="0" w:noVBand="1" w:val="04A0"/>
+      </w:tblPr>
+      <w:tblGrid>
+        <w:gridCol w:w="1440"/>
+        <w:gridCol w:w="1440"/>
+        <w:gridCol w:w="1440"/>
+        <w:gridCol w:w="1440"/>
+        <w:gridCol w:w="1440"/>
+        <w:gridCol w:w="1440"/>
+      </w:tblGrid>
+      <w:tr>
+        <w:tc>
+          <w:tcPr>
+            <w:tcW w:type="dxa" w:w="1440"/>
+          </w:tcPr>
+          <w:p>
+            <w:r>
+              <w:t>Model</w:t>
+            </w:r>
+          </w:p>
+        </w:tc>
+        <w:tc>
+          <w:tcPr>
+            <w:tcW w:type="dxa" w:w="1440"/>
+          </w:tcPr>
+          <w:p>
+            <w:r>
+              <w:t>MRR</w:t>
+            </w:r>
+          </w:p>
+        </w:tc>
+        <w:tc>
+          <w:tcPr>
+            <w:tcW w:type="dxa" w:w="1440"/>
+          </w:tcPr>
+          <w:p>
+            <w:r>
+              <w:t>Hits@1</w:t>
+            </w:r>
+          </w:p>
+        </w:tc>
+        <w:tc>
+          <w:tcPr>
+            <w:tcW w:type="dxa" w:w="1440"/>
+          </w:tcPr>
+          <w:p>
+            <w:r>
+              <w:t>Hits@3</w:t>
+            </w:r>
+          </w:p>
+        </w:tc>
+        <w:tc>
+          <w:tcPr>
+            <w:tcW w:type="dxa" w:w="1440"/>
+          </w:tcPr>
+          <w:p>
+            <w:r>
+              <w:t>Hits@5</w:t>
+            </w:r>
+          </w:p>
+        </w:tc>
+        <w:tc>
+          <w:tcPr>
+            <w:tcW w:type="dxa" w:w="1440"/>
+          </w:tcPr>
+          <w:p>
+            <w:r>
+              <w:t>Hits@10</w:t>
+            </w:r>
+          </w:p>
+        </w:tc>
+      </w:tr>
+      <w:tr>
+        <w:tc>
+          <w:tcPr>
+            <w:tcW w:type="dxa" w:w="1440"/>
+          </w:tcPr>
+          <w:p>
+            <w:r>
+              <w:t>TransE</w:t>
+            </w:r>
+          </w:p>
+        </w:tc>
+        <w:tc>
+          <w:tcPr>
+            <w:tcW w:type="dxa" w:w="1440"/>
+          </w:tcPr>
+          <w:p>
+            <w:r>
+              <w:t>0.0146 ± 0.0030</w:t>
+            </w:r>
+          </w:p>
+        </w:tc>
+        <w:tc>
+          <w:tcPr>
+            <w:tcW w:type="dxa" w:w="1440"/>
+          </w:tcPr>
+          <w:p>
+            <w:r>
+              <w:t>0.0039 ± 0.0021</w:t>
+            </w:r>
+          </w:p>
+        </w:tc>
+        <w:tc>
+          <w:tcPr>
+            <w:tcW w:type="dxa" w:w="1440"/>
+          </w:tcPr>
+          <w:p>
+            <w:r>
+              <w:t>0.0102 ± 0.0034</w:t>
+            </w:r>
+          </w:p>
+        </w:tc>
+        <w:tc>
+          <w:tcPr>
+            <w:tcW w:type="dxa" w:w="1440"/>
+          </w:tcPr>
+          <w:p>
+            <w:r>
+              <w:t>0.0158 ± 0.0054</w:t>
+            </w:r>
+          </w:p>
+        </w:tc>
+        <w:tc>
+          <w:tcPr>
+            <w:tcW w:type="dxa" w:w="1440"/>
+          </w:tcPr>
+          <w:p>
+            <w:r>
+              <w:t>0.0263 ± 0.0056</w:t>
+            </w:r>
+          </w:p>
+        </w:tc>
+      </w:tr>
+      <w:tr>
+        <w:tc>
+          <w:tcPr>
+            <w:tcW w:type="dxa" w:w="1440"/>
+          </w:tcPr>
+          <w:p>
+            <w:r>
+              <w:t>ProbCBR</w:t>
+            </w:r>
+          </w:p>
+        </w:tc>
+        <w:tc>
+          <w:tcPr>
+            <w:tcW w:type="dxa" w:w="1440"/>
+          </w:tcPr>
+          <w:p>
+            <w:r>
+              <w:t>0.0110 ± 0.0046</w:t>
+            </w:r>
+          </w:p>
+        </w:tc>
+        <w:tc>
+          <w:tcPr>
+            <w:tcW w:type="dxa" w:w="1440"/>
+          </w:tcPr>
+          <w:p>
+            <w:r>
+              <w:t>0.0041 ± 0.0032</w:t>
+            </w:r>
+          </w:p>
+        </w:tc>
+        <w:tc>
+          <w:tcPr>
+            <w:tcW w:type="dxa" w:w="1440"/>
+          </w:tcPr>
+          <w:p>
+            <w:r>
+              <w:t>0.0092 ± 0.0043</w:t>
+            </w:r>
+          </w:p>
+        </w:tc>
+        <w:tc>
+          <w:tcPr>
+            <w:tcW w:type="dxa" w:w="1440"/>
+          </w:tcPr>
+          <w:p>
+            <w:r>
+              <w:t>0.0133 ± 0.0057</w:t>
+            </w:r>
+          </w:p>
+        </w:tc>
+        <w:tc>
+          <w:tcPr>
+            <w:tcW w:type="dxa" w:w="1440"/>
+          </w:tcPr>
+          <w:p>
+            <w:r>
+              <w:t>0.0246 ± 0.0087</w:t>
+            </w:r>
+          </w:p>
+        </w:tc>
+      </w:tr>
+      <w:tr>
+        <w:tc>
+          <w:tcPr>
+            <w:tcW w:type="dxa" w:w="1440"/>
+          </w:tcPr>
+          <w:p>
+            <w:r>
+              <w:t>RotatE</w:t>
+            </w:r>
+          </w:p>
+        </w:tc>
+        <w:tc>
+          <w:tcPr>
+            <w:tcW w:type="dxa" w:w="1440"/>
+          </w:tcPr>
+          <w:p>
+            <w:r>
+              <w:t>0.0452 ± 0.0066</w:t>
+            </w:r>
+          </w:p>
+        </w:tc>
+        <w:tc>
+          <w:tcPr>
+            <w:tcW w:type="dxa" w:w="1440"/>
+          </w:tcPr>
+          <w:p>
+            <w:r>
+              <w:t>0.0128 ± 0.0043</w:t>
+            </w:r>
+          </w:p>
+        </w:tc>
+        <w:tc>
+          <w:tcPr>
+            <w:tcW w:type="dxa" w:w="1440"/>
+          </w:tcPr>
+          <w:p>
+            <w:r>
+              <w:t>0.0389 ± 0.0060</w:t>
+            </w:r>
+          </w:p>
+        </w:tc>
+        <w:tc>
+          <w:tcPr>
+            <w:tcW w:type="dxa" w:w="1440"/>
+          </w:tcPr>
+          <w:p>
+            <w:r>
+              <w:t>0.0631 ± 0.0130</w:t>
+            </w:r>
+          </w:p>
+        </w:tc>
+        <w:tc>
+          <w:tcPr>
+            <w:tcW w:type="dxa" w:w="1440"/>
+          </w:tcPr>
+          <w:p>
+            <w:r>
+              <w:t>0.1094 ± 0.0228</w:t>
+            </w:r>
+          </w:p>
+        </w:tc>
+      </w:tr>
+      <w:tr>
+        <w:tc>
+          <w:tcPr>
+            <w:tcW w:type="dxa" w:w="1440"/>
+          </w:tcPr>
+          <w:p>
+            <w:r>
+              <w:t>Simple Ensemble</w:t>
+            </w:r>
+          </w:p>
+        </w:tc>
+        <w:tc>
+          <w:tcPr>
+            <w:tcW w:type="dxa" w:w="1440"/>
+          </w:tcPr>
+          <w:p>
+            <w:r>
+              <w:t>0.0506 ± 0.0066</w:t>
+            </w:r>
+          </w:p>
+        </w:tc>
+        <w:tc>
+          <w:tcPr>
+            <w:tcW w:type="dxa" w:w="1440"/>
+          </w:tcPr>
+          <w:p>
+            <w:r>
+              <w:t>0.0149 ± 0.0041</w:t>
+            </w:r>
+          </w:p>
+        </w:tc>
+        <w:tc>
+          <w:tcPr>
+            <w:tcW w:type="dxa" w:w="1440"/>
+          </w:tcPr>
+          <w:p>
+            <w:r>
+              <w:t>0.0433 ± 0.0092</w:t>
+            </w:r>
+          </w:p>
+        </w:tc>
+        <w:tc>
+          <w:tcPr>
+            <w:tcW w:type="dxa" w:w="1440"/>
+          </w:tcPr>
+          <w:p>
+            <w:r>
+              <w:t>0.0678 ± 0.0106</w:t>
+            </w:r>
+          </w:p>
+        </w:tc>
+        <w:tc>
+          <w:tcPr>
+            <w:tcW w:type="dxa" w:w="1440"/>
+          </w:tcPr>
+          <w:p>
+            <w:r>
+              <w:t>0.1087 ± 0.0165</w:t>
+            </w:r>
+          </w:p>
+        </w:tc>
+      </w:tr>
+      <w:tr>
+        <w:tc>
+          <w:tcPr>
+            <w:tcW w:type="dxa" w:w="1440"/>
+          </w:tcPr>
+          <w:p>
+            <w:r>
+              <w:t>Path-Gated</w:t>
+            </w:r>
+          </w:p>
+        </w:tc>
+        <w:tc>
+          <w:tcPr>
+            <w:tcW w:type="dxa" w:w="1440"/>
+          </w:tcPr>
+          <w:p>
+            <w:r>
+              <w:t>0.0704 ± 0.0067</w:t>
+            </w:r>
+          </w:p>
+        </w:tc>
+        <w:tc>
+          <w:tcPr>
+            <w:tcW w:type="dxa" w:w="1440"/>
+          </w:tcPr>
+          <w:p>
+            <w:r>
+              <w:t>0.0209 ± 0.0047</w:t>
+            </w:r>
+          </w:p>
+        </w:tc>
+        <w:tc>
+          <w:tcPr>
+            <w:tcW w:type="dxa" w:w="1440"/>
+          </w:tcPr>
+          <w:p>
+            <w:r>
+              <w:t>0.0502 ± 0.0071</w:t>
+            </w:r>
+          </w:p>
+        </w:tc>
+        <w:tc>
+          <w:tcPr>
+            <w:tcW w:type="dxa" w:w="1440"/>
+          </w:tcPr>
+          <w:p>
+            <w:r>
+              <w:t>0.0747 ± 0.0140</w:t>
+            </w:r>
+          </w:p>
+        </w:tc>
+        <w:tc>
+          <w:tcPr>
+            <w:tcW w:type="dxa" w:w="1440"/>
+          </w:tcPr>
+          <w:p>
+            <w:r>
+              <w:t>0.1353 ± 0.0188</w:t>
+            </w:r>
+          </w:p>
+        </w:tc>
+      </w:tr>
+    </w:tbl>
+    <w:p>
+      <w:pPr>
+        <w:pStyle w:val="Heading1"/>
+      </w:pPr>
+      <w:r>
+        <w:t>6. Per-Slice Results (Path-Gated, Test Set)</w:t>
+      </w:r>
+    </w:p>
+    <w:tbl>
+      <w:tblPr>
+        <w:tblStyle w:val="TableGrid"/>
+        <w:tblW w:type="auto" w:w="0"/>
+        <w:tblLook w:firstColumn="1" w:firstRow="1" w:lastColumn="0" w:lastRow="0" w:noHBand="0" w:noVBand="1" w:val="04A0"/>
+      </w:tblPr>
+      <w:tblGrid>
+        <w:gridCol w:w="1440"/>
+        <w:gridCol w:w="1440"/>
+        <w:gridCol w:w="1440"/>
+        <w:gridCol w:w="1440"/>
+        <w:gridCol w:w="1440"/>
+        <w:gridCol w:w="1440"/>
+      </w:tblGrid>
+      <w:tr>
+        <w:tc>
+          <w:tcPr>
+            <w:tcW w:type="dxa" w:w="1440"/>
+          </w:tcPr>
+          <w:p>
+            <w:r>
+              <w:t>Model</w:t>
+            </w:r>
+          </w:p>
+        </w:tc>
+        <w:tc>
+          <w:tcPr>
+            <w:tcW w:type="dxa" w:w="1440"/>
+          </w:tcPr>
+          <w:p>
+            <w:r>
+              <w:t>MRR</w:t>
+            </w:r>
+          </w:p>
+        </w:tc>
+        <w:tc>
+          <w:tcPr>
+            <w:tcW w:type="dxa" w:w="1440"/>
+          </w:tcPr>
+          <w:p>
+            <w:r>
+              <w:t>Hits@1</w:t>
+            </w:r>
+          </w:p>
+        </w:tc>
+        <w:tc>
+          <w:tcPr>
+            <w:tcW w:type="dxa" w:w="1440"/>
+          </w:tcPr>
+          <w:p>
+            <w:r>
+              <w:t>Hits@3</w:t>
+            </w:r>
+          </w:p>
+        </w:tc>
+        <w:tc>
+          <w:tcPr>
+            <w:tcW w:type="dxa" w:w="1440"/>
+          </w:tcPr>
+          <w:p>
+            <w:r>
+              <w:t>Hits@5</w:t>
+            </w:r>
+          </w:p>
+        </w:tc>
+        <w:tc>
+          <w:tcPr>
+            <w:tcW w:type="dxa" w:w="1440"/>
+          </w:tcPr>
+          <w:p>
+            <w:r>
+              <w:t>Hits@10</w:t>
+            </w:r>
+          </w:p>
+        </w:tc>
+      </w:tr>
+      <w:tr>
+        <w:tc>
+          <w:tcPr>
+            <w:tcW w:type="dxa" w:w="1440"/>
+          </w:tcPr>
+          <w:p>
+            <w:r>
+              <w:t>slice_0</w:t>
+            </w:r>
+          </w:p>
+        </w:tc>
+        <w:tc>
+          <w:tcPr>
+            <w:tcW w:type="dxa" w:w="1440"/>
+          </w:tcPr>
+          <w:p>
+            <w:r>
+              <w:t>0.0720</w:t>
+            </w:r>
+          </w:p>
+        </w:tc>
+        <w:tc>
+          <w:tcPr>
+            <w:tcW w:type="dxa" w:w="1440"/>
+          </w:tcPr>
+          <w:p>
+            <w:r>
+              <w:t>0.0207</w:t>
+            </w:r>
+          </w:p>
+        </w:tc>
+        <w:tc>
+          <w:tcPr>
+            <w:tcW w:type="dxa" w:w="1440"/>
+          </w:tcPr>
+          <w:p>
+            <w:r>
+              <w:t>0.0533</w:t>
+            </w:r>
+          </w:p>
+        </w:tc>
+        <w:tc>
+          <w:tcPr>
+            <w:tcW w:type="dxa" w:w="1440"/>
+          </w:tcPr>
+          <w:p>
+            <w:r>
+              <w:t>0.0799</w:t>
+            </w:r>
+          </w:p>
+        </w:tc>
+        <w:tc>
+          <w:tcPr>
+            <w:tcW w:type="dxa" w:w="1440"/>
+          </w:tcPr>
+          <w:p>
+            <w:r>
+              <w:t>0.1302</w:t>
+            </w:r>
+          </w:p>
+        </w:tc>
+      </w:tr>
+      <w:tr>
+        <w:tc>
+          <w:tcPr>
+            <w:tcW w:type="dxa" w:w="1440"/>
+          </w:tcPr>
+          <w:p>
+            <w:r>
+              <w:t>slice_1</w:t>
+            </w:r>
+          </w:p>
+        </w:tc>
+        <w:tc>
+          <w:tcPr>
+            <w:tcW w:type="dxa" w:w="1440"/>
+          </w:tcPr>
+          <w:p>
+            <w:r>
+              <w:t>0.0715</w:t>
+            </w:r>
+          </w:p>
+        </w:tc>
+        <w:tc>
+          <w:tcPr>
+            <w:tcW w:type="dxa" w:w="1440"/>
+          </w:tcPr>
+          <w:p>
+            <w:r>
+              <w:t>0.0178</w:t>
+            </w:r>
+          </w:p>
+        </w:tc>
+        <w:tc>
+          <w:tcPr>
+            <w:tcW w:type="dxa" w:w="1440"/>
+          </w:tcPr>
+          <w:p>
+            <w:r>
+              <w:t>0.0562</w:t>
+            </w:r>
+          </w:p>
+        </w:tc>
+        <w:tc>
+          <w:tcPr>
+            <w:tcW w:type="dxa" w:w="1440"/>
+          </w:tcPr>
+          <w:p>
+            <w:r>
+              <w:t>0.0769</w:t>
+            </w:r>
+          </w:p>
+        </w:tc>
+        <w:tc>
+          <w:tcPr>
+            <w:tcW w:type="dxa" w:w="1440"/>
+          </w:tcPr>
+          <w:p>
+            <w:r>
+              <w:t>0.1420</w:t>
+            </w:r>
+          </w:p>
+        </w:tc>
+      </w:tr>
+      <w:tr>
+        <w:tc>
+          <w:tcPr>
+            <w:tcW w:type="dxa" w:w="1440"/>
+          </w:tcPr>
+          <w:p>
+            <w:r>
+              <w:t>slice_2</w:t>
+            </w:r>
+          </w:p>
+        </w:tc>
+        <w:tc>
+          <w:tcPr>
+            <w:tcW w:type="dxa" w:w="1440"/>
+          </w:tcPr>
+          <w:p>
+            <w:r>
+              <w:t>0.0778</w:t>
+            </w:r>
+          </w:p>
+        </w:tc>
+        <w:tc>
+          <w:tcPr>
+            <w:tcW w:type="dxa" w:w="1440"/>
+          </w:tcPr>
+          <w:p>
+            <w:r>
+              <w:t>0.0237</w:t>
+            </w:r>
+          </w:p>
+        </w:tc>
+        <w:tc>
+          <w:tcPr>
+            <w:tcW w:type="dxa" w:w="1440"/>
+          </w:tcPr>
+          <w:p>
+            <w:r>
+              <w:t>0.0562</w:t>
+            </w:r>
+          </w:p>
+        </w:tc>
+        <w:tc>
+          <w:tcPr>
+            <w:tcW w:type="dxa" w:w="1440"/>
+          </w:tcPr>
+          <w:p>
+            <w:r>
+              <w:t>0.0858</w:t>
+            </w:r>
+          </w:p>
+        </w:tc>
+        <w:tc>
+          <w:tcPr>
+            <w:tcW w:type="dxa" w:w="1440"/>
+          </w:tcPr>
+          <w:p>
+            <w:r>
+              <w:t>0.1450</w:t>
+            </w:r>
+          </w:p>
+        </w:tc>
+      </w:tr>
+      <w:tr>
+        <w:tc>
+          <w:tcPr>
+            <w:tcW w:type="dxa" w:w="1440"/>
+          </w:tcPr>
+          <w:p>
+            <w:r>
+              <w:t>slice_3</w:t>
+            </w:r>
+          </w:p>
+        </w:tc>
+        <w:tc>
+          <w:tcPr>
+            <w:tcW w:type="dxa" w:w="1440"/>
+          </w:tcPr>
+          <w:p>
+            <w:r>
+              <w:t>0.0600</w:t>
+            </w:r>
+          </w:p>
+        </w:tc>
+        <w:tc>
+          <w:tcPr>
+            <w:tcW w:type="dxa" w:w="1440"/>
+          </w:tcPr>
+          <w:p>
+            <w:r>
+              <w:t>0.0148</w:t>
+            </w:r>
+          </w:p>
+        </w:tc>
+        <w:tc>
+          <w:tcPr>
+            <w:tcW w:type="dxa" w:w="1440"/>
+          </w:tcPr>
+          <w:p>
+            <w:r>
+              <w:t>0.0444</w:t>
+            </w:r>
+          </w:p>
+        </w:tc>
+        <w:tc>
+          <w:tcPr>
+            <w:tcW w:type="dxa" w:w="1440"/>
+          </w:tcPr>
+          <w:p>
+            <w:r>
+              <w:t>0.0651</w:t>
+            </w:r>
+          </w:p>
+        </w:tc>
+        <w:tc>
+          <w:tcPr>
+            <w:tcW w:type="dxa" w:w="1440"/>
+          </w:tcPr>
+          <w:p>
+            <w:r>
+              <w:t>0.1183</w:t>
+            </w:r>
+          </w:p>
+        </w:tc>
+      </w:tr>
+      <w:tr>
+        <w:tc>
+          <w:tcPr>
+            <w:tcW w:type="dxa" w:w="1440"/>
+          </w:tcPr>
+          <w:p>
+            <w:r>
+              <w:t>slice_4</w:t>
+            </w:r>
+          </w:p>
+        </w:tc>
+        <w:tc>
+          <w:tcPr>
+            <w:tcW w:type="dxa" w:w="1440"/>
+          </w:tcPr>
+          <w:p>
+            <w:r>
+              <w:t>0.0596</w:t>
+            </w:r>
+          </w:p>
+        </w:tc>
+        <w:tc>
+          <w:tcPr>
+            <w:tcW w:type="dxa" w:w="1440"/>
+          </w:tcPr>
+          <w:p>
+            <w:r>
+              <w:t>0.0170</w:t>
+            </w:r>
+          </w:p>
+        </w:tc>
+        <w:tc>
+          <w:tcPr>
+            <w:tcW w:type="dxa" w:w="1440"/>
+          </w:tcPr>
+          <w:p>
+            <w:r>
+              <w:t>0.0444</w:t>
+            </w:r>
+          </w:p>
+        </w:tc>
+        <w:tc>
+          <w:tcPr>
+            <w:tcW w:type="dxa" w:w="1440"/>
+          </w:tcPr>
+          <w:p>
+            <w:r>
+              <w:t>0.0592</w:t>
+            </w:r>
+          </w:p>
+        </w:tc>
+        <w:tc>
+          <w:tcPr>
+            <w:tcW w:type="dxa" w:w="1440"/>
+          </w:tcPr>
+          <w:p>
+            <w:r>
+              <w:t>0.1302</w:t>
+            </w:r>
+          </w:p>
+        </w:tc>
+      </w:tr>
+    </w:tbl>
+    <w:p>
+      <w:pPr>
+        <w:pStyle w:val="Heading1"/>
+      </w:pPr>
+      <w:r>
+        <w:t>7. Experimental Status</w:t>
+      </w:r>
+    </w:p>
+    <w:tbl>
+      <w:tblPr>
+        <w:tblStyle w:val="TableGrid"/>
+        <w:tblW w:type="auto" w:w="0"/>
+        <w:tblLook w:firstColumn="1" w:firstRow="1" w:lastColumn="0" w:lastRow="0" w:noHBand="0" w:noVBand="1" w:val="04A0"/>
+      </w:tblPr>
+      <w:tblGrid>
+        <w:gridCol w:w="2880"/>
+        <w:gridCol w:w="2880"/>
+        <w:gridCol w:w="2880"/>
+      </w:tblGrid>
+      <w:tr>
+        <w:tc>
+          <w:tcPr>
+            <w:tcW w:type="dxa" w:w="2880"/>
+          </w:tcPr>
+          <w:p>
+            <w:r>
+              <w:t>Task</w:t>
+            </w:r>
+          </w:p>
+        </w:tc>
+        <w:tc>
+          <w:tcPr>
+            <w:tcW w:type="dxa" w:w="2880"/>
+          </w:tcPr>
+          <w:p>
+            <w:r>
+              <w:t>Status</w:t>
+            </w:r>
+          </w:p>
+        </w:tc>
+        <w:tc>
+          <w:tcPr>
+            <w:tcW w:type="dxa" w:w="2880"/>
+          </w:tcPr>
+          <w:p>
+            <w:r>
+              <w:t>Notes</w:t>
+            </w:r>
+          </w:p>
+        </w:tc>
+      </w:tr>
+      <w:tr>
+        <w:tc>
+          <w:tcPr>
+            <w:tcW w:type="dxa" w:w="2880"/>
+          </w:tcPr>
+          <w:p>
+            <w:r>
+              <w:t>MIND update (DrugCentral)</w:t>
+            </w:r>
+          </w:p>
+        </w:tc>
+        <w:tc>
+          <w:tcPr>
+            <w:tcW w:type="dxa" w:w="2880"/>
+          </w:tcPr>
+          <w:p>
+            <w:r>
+              <w:t>DONE</w:t>
+            </w:r>
+          </w:p>
+        </w:tc>
+        <w:tc>
+          <w:tcPr>
+            <w:tcW w:type="dxa" w:w="2880"/>
+          </w:tcPr>
+          <w:p>
+            <w:r>
+              <w:t>1,391 new edges; total 6,761</w:t>
+            </w:r>
+          </w:p>
+        </w:tc>
+      </w:tr>
+      <w:tr>
+        <w:tc>
+          <w:tcPr>
+            <w:tcW w:type="dxa" w:w="2880"/>
+          </w:tcPr>
+          <w:p>
+            <w:r>
+              <w:t>5-fold stratified splits</w:t>
+            </w:r>
+          </w:p>
+        </w:tc>
+        <w:tc>
+          <w:tcPr>
+            <w:tcW w:type="dxa" w:w="2880"/>
+          </w:tcPr>
+          <w:p>
+            <w:r>
+              <w:t>DONE</w:t>
+            </w:r>
+          </w:p>
+        </w:tc>
+        <w:tc>
+          <w:tcPr>
+            <w:tcW w:type="dxa" w:w="2880"/>
+          </w:tcPr>
+          <w:p>
+            <w:r>
+              <w:t>676 test/valid per slice</w:t>
+            </w:r>
+          </w:p>
+        </w:tc>
+      </w:tr>
+      <w:tr>
+        <w:tc>
+          <w:tcPr>
+            <w:tcW w:type="dxa" w:w="2880"/>
+          </w:tcPr>
+          <w:p>
+            <w:r>
+              <w:t>TransE (all 5 slices)</w:t>
+            </w:r>
+          </w:p>
+        </w:tc>
+        <w:tc>
+          <w:tcPr>
+            <w:tcW w:type="dxa" w:w="2880"/>
+          </w:tcPr>
+          <w:p>
+            <w:r>
+              <w:t>DONE</w:t>
+            </w:r>
+          </w:p>
+        </w:tc>
+        <w:tc>
+          <w:tcPr>
+            <w:tcW w:type="dxa" w:w="2880"/>
+          </w:tcPr>
+          <w:p>
+            <w:r>
+              <w:t>Kaggle GPU</w:t>
+            </w:r>
+          </w:p>
+        </w:tc>
+      </w:tr>
+      <w:tr>
+        <w:tc>
+          <w:tcPr>
+            <w:tcW w:type="dxa" w:w="2880"/>
+          </w:tcPr>
+          <w:p>
+            <w:r>
+              <w:t>RotatE (all 5 slices)</w:t>
+            </w:r>
+          </w:p>
+        </w:tc>
+        <w:tc>
+          <w:tcPr>
+            <w:tcW w:type="dxa" w:w="2880"/>
+          </w:tcPr>
+          <w:p>
+            <w:r>
+              <w:t>DONE</w:t>
+            </w:r>
+          </w:p>
+        </w:tc>
+        <w:tc>
+          <w:tcPr>
+            <w:tcW w:type="dxa" w:w="2880"/>
+          </w:tcPr>
+          <w:p>
+            <w:r>
+              <w:t>Kaggle GPU</w:t>
+            </w:r>
+          </w:p>
+        </w:tc>
+      </w:tr>
+      <w:tr>
+        <w:tc>
+          <w:tcPr>
+            <w:tcW w:type="dxa" w:w="2880"/>
+          </w:tcPr>
+          <w:p>
+            <w:r>
+              <w:t>ProbCBR (all 5 slices)</w:t>
+            </w:r>
+          </w:p>
+        </w:tc>
+        <w:tc>
+          <w:tcPr>
+            <w:tcW w:type="dxa" w:w="2880"/>
+          </w:tcPr>
+          <w:p>
+            <w:r>
+              <w:t>DONE</w:t>
+            </w:r>
+          </w:p>
+        </w:tc>
+        <w:tc>
+          <w:tcPr>
+            <w:tcW w:type="dxa" w:w="2880"/>
+          </w:tcPr>
+          <w:p>
+            <w:r>
+              <w:t>Kaggle GPU</w:t>
+            </w:r>
+          </w:p>
+        </w:tc>
+      </w:tr>
+      <w:tr>
+        <w:tc>
+          <w:tcPr>
+            <w:tcW w:type="dxa" w:w="2880"/>
+          </w:tcPr>
+          <w:p>
+            <w:r>
+              <w:t>Simple Ensemble (all 5 slices)</w:t>
+            </w:r>
+          </w:p>
+        </w:tc>
+        <w:tc>
+          <w:tcPr>
+            <w:tcW w:type="dxa" w:w="2880"/>
+          </w:tcPr>
+          <w:p>
+            <w:r>
+              <w:t>DONE</w:t>
+            </w:r>
+          </w:p>
+        </w:tc>
+        <w:tc>
+          <w:tcPr>
+            <w:tcW w:type="dxa" w:w="2880"/>
+          </w:tcPr>
+          <w:p>
+            <w:r>
+              <w:t>Optuna 200 trials</w:t>
+            </w:r>
+          </w:p>
+        </w:tc>
+      </w:tr>
+      <w:tr>
+        <w:tc>
+          <w:tcPr>
+            <w:tcW w:type="dxa" w:w="2880"/>
+          </w:tcPr>
+          <w:p>
+            <w:r>
+              <w:t>Path-Gated (all 5 slices)</w:t>
+            </w:r>
+          </w:p>
+        </w:tc>
+        <w:tc>
+          <w:tcPr>
+            <w:tcW w:type="dxa" w:w="2880"/>
+          </w:tcPr>
+          <w:p>
+            <w:r>
+              <w:t>DONE</w:t>
+            </w:r>
+          </w:p>
+        </w:tc>
+        <w:tc>
+          <w:tcPr>
+            <w:tcW w:type="dxa" w:w="2880"/>
+          </w:tcPr>
+          <w:p>
+            <w:r>
+              <w:t>Optuna 300 trials; best method</w:t>
+            </w:r>
+          </w:p>
+        </w:tc>
+      </w:tr>
+      <w:tr>
+        <w:tc>
+          <w:tcPr>
+            <w:tcW w:type="dxa" w:w="2880"/>
+          </w:tcPr>
+          <w:p>
+            <w:r>
+              <w:t>Drug repurposing candidates</w:t>
+            </w:r>
+          </w:p>
+        </w:tc>
+        <w:tc>
+          <w:tcPr>
+            <w:tcW w:type="dxa" w:w="2880"/>
+          </w:tcPr>
+          <w:p>
+            <w:r>
+              <w:t>DONE</w:t>
+            </w:r>
+          </w:p>
+        </w:tc>
+        <w:tc>
+          <w:tcPr>
+            <w:tcW w:type="dxa" w:w="2880"/>
+          </w:tcPr>
+          <w:p>
+            <w:r>
+              <w:t>455 high-confidence; 30 resolved</w:t>
+            </w:r>
+          </w:p>
+        </w:tc>
+      </w:tr>
+      <w:tr>
+        <w:tc>
+          <w:tcPr>
+            <w:tcW w:type="dxa" w:w="2880"/>
+          </w:tcPr>
+          <w:p>
+            <w:r>
+              <w:t>ULTRA zero-shot evaluation</w:t>
+            </w:r>
+          </w:p>
+        </w:tc>
+        <w:tc>
+          <w:tcPr>
+            <w:tcW w:type="dxa" w:w="2880"/>
+          </w:tcPr>
+          <w:p>
+            <w:r>
+              <w:t>DONE</w:t>
+            </w:r>
+          </w:p>
+        </w:tc>
+        <w:tc>
+          <w:tcPr>
+            <w:tcW w:type="dxa" w:w="2880"/>
+          </w:tcPr>
+          <w:p>
+            <w:r>
+              <w:t>MRR 0.3569±0.0092; 5.2x over Path-Gated</w:t>
+            </w:r>
+          </w:p>
+        </w:tc>
+      </w:tr>
+      <w:tr>
+        <w:tc>
+          <w:tcPr>
+            <w:tcW w:type="dxa" w:w="2880"/>
+          </w:tcPr>
+          <w:p>
+            <w:r>
+              <w:t>ULTRA path extraction</w:t>
+            </w:r>
+          </w:p>
+        </w:tc>
+        <w:tc>
+          <w:tcPr>
+            <w:tcW w:type="dxa" w:w="2880"/>
+          </w:tcPr>
+          <w:p>
+            <w:r>
+              <w:t>PARTIAL</w:t>
+            </w:r>
+          </w:p>
+        </w:tc>
+        <w:tc>
+          <w:tcPr>
+            <w:tcW w:type="dxa" w:w="2880"/>
+          </w:tcPr>
+          <w:p>
+            <w:r>
+              <w:t>slice_0 done (902/1977 with paths); slices 1-4 pending</w:t>
+            </w:r>
+          </w:p>
+        </w:tc>
+      </w:tr>
+      <w:tr>
+        <w:tc>
+          <w:tcPr>
+            <w:tcW w:type="dxa" w:w="2880"/>
+          </w:tcPr>
+          <w:p>
+            <w:r>
+              <w:t>bioRxiv preprint</w:t>
+            </w:r>
+          </w:p>
+        </w:tc>
+        <w:tc>
+          <w:tcPr>
+            <w:tcW w:type="dxa" w:w="2880"/>
+          </w:tcPr>
+          <w:p>
+            <w:r>
+              <w:t>POSTED</w:t>
+            </w:r>
+          </w:p>
+        </w:tc>
+        <w:tc>
+          <w:tcPr>
+            <w:tcW w:type="dxa" w:w="2880"/>
+          </w:tcPr>
+          <w:p>
+            <w:r>
+              <w:t>doi:10.1101/2024.07.16.603664</w:t>
+            </w:r>
+          </w:p>
+        </w:tc>
+      </w:tr>
+      <w:tr>
+        <w:tc>
+          <w:tcPr>
+            <w:tcW w:type="dxa" w:w="2880"/>
+          </w:tcPr>
+          <w:p>
+            <w:r>
+              <w:t>GitHub repo</w:t>
+            </w:r>
+          </w:p>
+        </w:tc>
+        <w:tc>
+          <w:tcPr>
+            <w:tcW w:type="dxa" w:w="2880"/>
+          </w:tcPr>
+          <w:p>
+            <w:r>
+              <w:t>PUBLIC</w:t>
+            </w:r>
+          </w:p>
+        </w:tc>
+        <w:tc>
+          <w:tcPr>
+            <w:tcW w:type="dxa" w:w="2880"/>
+          </w:tcPr>
+          <w:p>
+            <w:r>
+              <w:t>meghasin/WeightedKgBlend</w:t>
+            </w:r>
+          </w:p>
+        </w:tc>
+      </w:tr>
+      <w:tr>
+        <w:tc>
+          <w:tcPr>
+            <w:tcW w:type="dxa" w:w="2880"/>
+          </w:tcPr>
+          <w:p>
+            <w:r>
+              <w:t>NeuralPathReasoning-MIND repo</w:t>
+            </w:r>
+          </w:p>
+        </w:tc>
+        <w:tc>
+          <w:tcPr>
+            <w:tcW w:type="dxa" w:w="2880"/>
+          </w:tcPr>
+          <w:p>
+            <w:r>
+              <w:t>PUBLIC</w:t>
+            </w:r>
+          </w:p>
+        </w:tc>
+        <w:tc>
+          <w:tcPr>
+            <w:tcW w:type="dxa" w:w="2880"/>
+          </w:tcPr>
+          <w:p>
+            <w:r>
+              <w:t>meghasin/NeuralPathReasoning-MIND</w:t>
+            </w:r>
+          </w:p>
+        </w:tc>
+      </w:tr>
+    </w:tbl>
+    <w:p>
+      <w:pPr>
+        <w:pStyle w:val="Heading1"/>
+      </w:pPr>
+      <w:r>
+        <w:t>8. Follow-up: ULTRA Zero-Shot (NeuralPathReasoning-MIND)</w:t>
+      </w:r>
+    </w:p>
+    <w:p>
+      <w:r>
+        <w:t>As a follow-up, we evaluated ULTRA (Neural Bellman-Ford Networks, mgalkin/ultra_50g) in zero-shot mode on the same MIND splits_updated benchmark. ULTRA was pre-trained on 50 knowledge graphs and applied directly to MIND without any fine-tuning on indication edges.</w:t>
       </w:r>
     </w:p>
     <w:tbl>
@@ -377,10 +2019,7 @@
           </w:tcPr>
           <w:p>
             <w:r>
-              <w:rPr>
-                <w:b/>
-              </w:rPr>
-              <w:t>Method</w:t>
+              <w:t>Model</w:t>
             </w:r>
           </w:p>
         </w:tc>
@@ -390,9 +2029,6 @@
           </w:tcPr>
           <w:p>
             <w:r>
-              <w:rPr>
-                <w:b/>
-              </w:rPr>
               <w:t>MRR</w:t>
             </w:r>
           </w:p>
@@ -403,9 +2039,6 @@
           </w:tcPr>
           <w:p>
             <w:r>
-              <w:rPr>
-                <w:b/>
-              </w:rPr>
               <w:t>Hits@1</w:t>
             </w:r>
           </w:p>
@@ -416,10 +2049,7 @@
           </w:tcPr>
           <w:p>
             <w:r>
-              <w:rPr>
-                <w:b/>
-              </w:rPr>
-              <w:t>Hits@10</w:t>
+              <w:t>Hits@3</w:t>
             </w:r>
           </w:p>
         </w:tc>
@@ -429,10 +2059,7 @@
           </w:tcPr>
           <w:p>
             <w:r>
-              <w:rPr>
-                <w:b/>
-              </w:rPr>
-              <w:t>vs RotatE</w:t>
+              <w:t>Hits@10</w:t>
             </w:r>
           </w:p>
         </w:tc>
@@ -444,7 +2071,7 @@
           </w:tcPr>
           <w:p>
             <w:r>
-              <w:t>TransE</w:t>
+              <w:t>Path-Gated (best WKB)</w:t>
             </w:r>
           </w:p>
         </w:tc>
@@ -454,7 +2081,7 @@
           </w:tcPr>
           <w:p>
             <w:r>
-              <w:t>0.0151</w:t>
+              <w:t>0.0682 ± 0.0107</w:t>
             </w:r>
           </w:p>
         </w:tc>
@@ -464,7 +2091,7 @@
           </w:tcPr>
           <w:p>
             <w:r>
-              <w:t>0.0019</w:t>
+              <w:t>0.0188 ± 0.0073</w:t>
             </w:r>
           </w:p>
         </w:tc>
@@ -474,7 +2101,7 @@
           </w:tcPr>
           <w:p>
             <w:r>
-              <w:t>0.0320</w:t>
+              <w:t>0.0493 ± 0.0131</w:t>
             </w:r>
           </w:p>
         </w:tc>
@@ -484,7 +2111,7 @@
           </w:tcPr>
           <w:p>
             <w:r>
-              <w:t>—</w:t>
+              <w:t>0.1291 ± 0.0263</w:t>
             </w:r>
           </w:p>
         </w:tc>
@@ -496,7 +2123,7 @@
           </w:tcPr>
           <w:p>
             <w:r>
-              <w:t>RotatE</w:t>
+              <w:t>ULTRA zero-shot</w:t>
             </w:r>
           </w:p>
         </w:tc>
@@ -506,7 +2133,7 @@
           </w:tcPr>
           <w:p>
             <w:r>
-              <w:t>0.0551</w:t>
+              <w:t>0.3569 ± 0.0092</w:t>
             </w:r>
           </w:p>
         </w:tc>
@@ -516,7 +2143,7 @@
           </w:tcPr>
           <w:p>
             <w:r>
-              <w:t>0.0169</w:t>
+              <w:t>0.2824 ± 0.0101</w:t>
             </w:r>
           </w:p>
         </w:tc>
@@ -526,7 +2153,7 @@
           </w:tcPr>
           <w:p>
             <w:r>
-              <w:t>0.1109</w:t>
+              <w:t>0.3779 ± 0.0090</w:t>
             </w:r>
           </w:p>
         </w:tc>
@@ -536,175 +2163,71 @@
           </w:tcPr>
           <w:p>
             <w:r>
-              <w:t>baseline</w:t>
-            </w:r>
-          </w:p>
-        </w:tc>
-      </w:tr>
-      <w:tr>
-        <w:tc>
-          <w:tcPr>
-            <w:tcW w:type="dxa" w:w="1728"/>
-          </w:tcPr>
-          <w:p>
-            <w:r>
-              <w:t>ProbCBR</w:t>
-            </w:r>
-          </w:p>
-        </w:tc>
-        <w:tc>
-          <w:tcPr>
-            <w:tcW w:type="dxa" w:w="1728"/>
-          </w:tcPr>
-          <w:p>
-            <w:r>
-              <w:t>0.0132</w:t>
-            </w:r>
-          </w:p>
-        </w:tc>
-        <w:tc>
-          <w:tcPr>
-            <w:tcW w:type="dxa" w:w="1728"/>
-          </w:tcPr>
-          <w:p>
-            <w:r>
-              <w:t>0.0037</w:t>
-            </w:r>
-          </w:p>
-        </w:tc>
-        <w:tc>
-          <w:tcPr>
-            <w:tcW w:type="dxa" w:w="1728"/>
-          </w:tcPr>
-          <w:p>
-            <w:r>
-              <w:t>0.0242</w:t>
-            </w:r>
-          </w:p>
-        </w:tc>
-        <w:tc>
-          <w:tcPr>
-            <w:tcW w:type="dxa" w:w="1728"/>
-          </w:tcPr>
-          <w:p>
-            <w:r>
-              <w:t>—</w:t>
-            </w:r>
-          </w:p>
-        </w:tc>
-      </w:tr>
-      <w:tr>
-        <w:tc>
-          <w:tcPr>
-            <w:tcW w:type="dxa" w:w="1728"/>
-          </w:tcPr>
-          <w:p>
-            <w:r>
-              <w:t>Simple Ensemble</w:t>
-            </w:r>
-          </w:p>
-        </w:tc>
-        <w:tc>
-          <w:tcPr>
-            <w:tcW w:type="dxa" w:w="1728"/>
-          </w:tcPr>
-          <w:p>
-            <w:r>
-              <w:t>0.0577</w:t>
-            </w:r>
-          </w:p>
-        </w:tc>
-        <w:tc>
-          <w:tcPr>
-            <w:tcW w:type="dxa" w:w="1728"/>
-          </w:tcPr>
-          <w:p>
-            <w:r>
-              <w:t>0.0169</w:t>
-            </w:r>
-          </w:p>
-        </w:tc>
-        <w:tc>
-          <w:tcPr>
-            <w:tcW w:type="dxa" w:w="1728"/>
-          </w:tcPr>
-          <w:p>
-            <w:r>
-              <w:t>0.1109</w:t>
-            </w:r>
-          </w:p>
-        </w:tc>
-        <w:tc>
-          <w:tcPr>
-            <w:tcW w:type="dxa" w:w="1728"/>
-          </w:tcPr>
-          <w:p>
-            <w:r>
-              <w:t>+5% MRR</w:t>
-            </w:r>
-          </w:p>
-        </w:tc>
-      </w:tr>
-      <w:tr>
-        <w:tc>
-          <w:tcPr>
-            <w:tcW w:type="dxa" w:w="1728"/>
-          </w:tcPr>
-          <w:p>
-            <w:r>
-              <w:t>Path-Gated ★</w:t>
-            </w:r>
-          </w:p>
-        </w:tc>
-        <w:tc>
-          <w:tcPr>
-            <w:tcW w:type="dxa" w:w="1728"/>
-          </w:tcPr>
-          <w:p>
-            <w:r>
-              <w:t>0.0754</w:t>
-            </w:r>
-          </w:p>
-        </w:tc>
-        <w:tc>
-          <w:tcPr>
-            <w:tcW w:type="dxa" w:w="1728"/>
-          </w:tcPr>
-          <w:p>
-            <w:r>
-              <w:t>0.0188</w:t>
-            </w:r>
-          </w:p>
-        </w:tc>
-        <w:tc>
-          <w:tcPr>
-            <w:tcW w:type="dxa" w:w="1728"/>
-          </w:tcPr>
-          <w:p>
-            <w:r>
-              <w:t>0.1635</w:t>
-            </w:r>
-          </w:p>
-        </w:tc>
-        <w:tc>
-          <w:tcPr>
-            <w:tcW w:type="dxa" w:w="1728"/>
-          </w:tcPr>
-          <w:p>
-            <w:r>
-              <w:t>+37% MRR, +47% H@10</w:t>
+              <w:t>0.5004 ± 0.0153</w:t>
             </w:r>
           </w:p>
         </w:tc>
       </w:tr>
     </w:tbl>
-    <w:p/>
+    <w:p>
+      <w:r>
+        <w:t>ULTRA zero-shot achieves 5.2× MRR improvement and 3.9× Hits@10 over Path-Gated, with no fine-tuning. Hits@10 = 0.50 means the correct disease is in the top-10 predictions for half of all drug queries.</w:t>
+      </w:r>
+    </w:p>
     <w:p>
       <w:pPr>
-        <w:pStyle w:val="Heading2"/>
+        <w:pStyle w:val="Heading1"/>
       </w:pPr>
       <w:r>
-        <w:t>Experimental Status</w:t>
+        <w:t>9. Key Findings</w:t>
+      </w:r>
+    </w:p>
+    <w:p>
+      <w:pPr>
+        <w:pStyle w:val="ListBullet"/>
+      </w:pPr>
+      <w:r>
+        <w:t>Path-Gated Re-ranking is the best WeightedKgBlend method — consistently outperforms all baselines. Optimal α≈0 across all slices confirms that ProbCBR path scores alone drive re-ranking.</w:t>
+      </w:r>
+    </w:p>
+    <w:p>
+      <w:pPr>
+        <w:pStyle w:val="ListBullet"/>
+      </w:pPr>
+      <w:r>
+        <w:t>Simple Ensemble adds marginal gain over RotatE alone — optimal weights assign ~92% to RotatE, suggesting CBR path scores are noisy in the simple weighted sum formulation.</w:t>
+      </w:r>
+    </w:p>
+    <w:p>
+      <w:pPr>
+        <w:pStyle w:val="ListBullet"/>
+      </w:pPr>
+      <w:r>
+        <w:t>Path coverage is the main bottleneck — only ~41% of RotatE top-10 candidates have a ProbCBR path. Improving path coverage is the main lever for WKB gains.</w:t>
+      </w:r>
+    </w:p>
+    <w:p>
+      <w:pPr>
+        <w:pStyle w:val="ListBullet"/>
+      </w:pPr>
+      <w:r>
+        <w:t>44 rank-1 predictions with mechanistic paths across 5 slices — strongest repurposing candidates with interpretable biological routes.</w:t>
+      </w:r>
+    </w:p>
+    <w:p>
+      <w:pPr>
+        <w:pStyle w:val="ListBullet"/>
+      </w:pPr>
+      <w:r>
+        <w:t>ULTRA zero-shot dramatically outperforms all WKB methods — confirms the power of neural path reasoning foundation models for biomedical KG completion.</w:t>
+      </w:r>
+    </w:p>
+    <w:p>
+      <w:pPr>
+        <w:pStyle w:val="Heading1"/>
+      </w:pPr>
+      <w:r>
+        <w:t>10. Selected Drug Repurposing Candidates (Path-Gated)</w:t>
       </w:r>
     </w:p>
     <w:tbl>
@@ -714,33 +2237,49 @@
         <w:tblLook w:firstColumn="1" w:firstRow="1" w:lastColumn="0" w:lastRow="0" w:noHBand="0" w:noVBand="1" w:val="04A0"/>
       </w:tblPr>
       <w:tblGrid>
-        <w:gridCol w:w="4320"/>
-        <w:gridCol w:w="4320"/>
+        <w:gridCol w:w="2160"/>
+        <w:gridCol w:w="2160"/>
+        <w:gridCol w:w="2160"/>
+        <w:gridCol w:w="2160"/>
       </w:tblGrid>
       <w:tr>
         <w:tc>
           <w:tcPr>
-            <w:tcW w:type="dxa" w:w="4320"/>
+            <w:tcW w:type="dxa" w:w="2160"/>
           </w:tcPr>
           <w:p>
             <w:r>
-              <w:rPr>
-                <w:b/>
-              </w:rPr>
-              <w:t>Component</w:t>
+              <w:t>Drug</w:t>
             </w:r>
           </w:p>
         </w:tc>
         <w:tc>
           <w:tcPr>
-            <w:tcW w:type="dxa" w:w="4320"/>
+            <w:tcW w:type="dxa" w:w="2160"/>
           </w:tcPr>
           <w:p>
             <w:r>
-              <w:rPr>
-                <w:b/>
-              </w:rPr>
-              <w:t>Status</w:t>
+              <w:t>Disease</w:t>
+            </w:r>
+          </w:p>
+        </w:tc>
+        <w:tc>
+          <w:tcPr>
+            <w:tcW w:type="dxa" w:w="2160"/>
+          </w:tcPr>
+          <w:p>
+            <w:r>
+              <w:t>Rank</w:t>
+            </w:r>
+          </w:p>
+        </w:tc>
+        <w:tc>
+          <w:tcPr>
+            <w:tcW w:type="dxa" w:w="2160"/>
+          </w:tcPr>
+          <w:p>
+            <w:r>
+              <w:t>Mechanistic Path</w:t>
             </w:r>
           </w:p>
         </w:tc>
@@ -748,21 +2287,41 @@
       <w:tr>
         <w:tc>
           <w:tcPr>
-            <w:tcW w:type="dxa" w:w="4320"/>
+            <w:tcW w:type="dxa" w:w="2160"/>
           </w:tcPr>
           <w:p>
             <w:r>
-              <w:t>5-fold CV setup</w:t>
+              <w:t>nicardipine</w:t>
             </w:r>
           </w:p>
         </w:tc>
         <w:tc>
           <w:tcPr>
-            <w:tcW w:type="dxa" w:w="4320"/>
+            <w:tcW w:type="dxa" w:w="2160"/>
           </w:tcPr>
           <w:p>
             <w:r>
-              <w:t>Complete</w:t>
+              <w:t>hypertensive disorder</w:t>
+            </w:r>
+          </w:p>
+        </w:tc>
+        <w:tc>
+          <w:tcPr>
+            <w:tcW w:type="dxa" w:w="2160"/>
+          </w:tcPr>
+          <w:p>
+            <w:r>
+              <w:t>1</w:t>
+            </w:r>
+          </w:p>
+        </w:tc>
+        <w:tc>
+          <w:tcPr>
+            <w:tcW w:type="dxa" w:w="2160"/>
+          </w:tcPr>
+          <w:p>
+            <w:r>
+              <w:t>inhibits CACNA1C → associated_with → hypertensive disorder</w:t>
             </w:r>
           </w:p>
         </w:tc>
@@ -770,21 +2329,41 @@
       <w:tr>
         <w:tc>
           <w:tcPr>
-            <w:tcW w:type="dxa" w:w="4320"/>
+            <w:tcW w:type="dxa" w:w="2160"/>
           </w:tcPr>
           <w:p>
             <w:r>
-              <w:t>KGE slice_0 (TransE, RotatE)</w:t>
+              <w:t>vismodegib</w:t>
             </w:r>
           </w:p>
         </w:tc>
         <w:tc>
           <w:tcPr>
-            <w:tcW w:type="dxa" w:w="4320"/>
+            <w:tcW w:type="dxa" w:w="2160"/>
           </w:tcPr>
           <w:p>
             <w:r>
-              <w:t>Complete</w:t>
+              <w:t>basal cell carcinoma</w:t>
+            </w:r>
+          </w:p>
+        </w:tc>
+        <w:tc>
+          <w:tcPr>
+            <w:tcW w:type="dxa" w:w="2160"/>
+          </w:tcPr>
+          <w:p>
+            <w:r>
+              <w:t>1</w:t>
+            </w:r>
+          </w:p>
+        </w:tc>
+        <w:tc>
+          <w:tcPr>
+            <w:tcW w:type="dxa" w:w="2160"/>
+          </w:tcPr>
+          <w:p>
+            <w:r>
+              <w:t>inhibits SMO → marker_mechanism → BCC</w:t>
             </w:r>
           </w:p>
         </w:tc>
@@ -792,21 +2371,41 @@
       <w:tr>
         <w:tc>
           <w:tcPr>
-            <w:tcW w:type="dxa" w:w="4320"/>
+            <w:tcW w:type="dxa" w:w="2160"/>
           </w:tcPr>
           <w:p>
             <w:r>
-              <w:t>KGE slices 1–4</w:t>
+              <w:t>benzatropine</w:t>
             </w:r>
           </w:p>
         </w:tc>
         <w:tc>
           <w:tcPr>
-            <w:tcW w:type="dxa" w:w="4320"/>
+            <w:tcW w:type="dxa" w:w="2160"/>
           </w:tcPr>
           <w:p>
             <w:r>
-              <w:t>In progress</w:t>
+              <w:t>Parkinson's disease</w:t>
+            </w:r>
+          </w:p>
+        </w:tc>
+        <w:tc>
+          <w:tcPr>
+            <w:tcW w:type="dxa" w:w="2160"/>
+          </w:tcPr>
+          <w:p>
+            <w:r>
+              <w:t>1</w:t>
+            </w:r>
+          </w:p>
+        </w:tc>
+        <w:tc>
+          <w:tcPr>
+            <w:tcW w:type="dxa" w:w="2160"/>
+          </w:tcPr>
+          <w:p>
+            <w:r>
+              <w:t>inhibits DAT → associated_with → Parkinson's</w:t>
             </w:r>
           </w:p>
         </w:tc>
@@ -814,21 +2413,41 @@
       <w:tr>
         <w:tc>
           <w:tcPr>
-            <w:tcW w:type="dxa" w:w="4320"/>
+            <w:tcW w:type="dxa" w:w="2160"/>
           </w:tcPr>
           <w:p>
             <w:r>
-              <w:t>ProbCBR slices 0–2</w:t>
+              <w:t>metformin</w:t>
             </w:r>
           </w:p>
         </w:tc>
         <w:tc>
           <w:tcPr>
-            <w:tcW w:type="dxa" w:w="4320"/>
+            <w:tcW w:type="dxa" w:w="2160"/>
           </w:tcPr>
           <w:p>
             <w:r>
-              <w:t>Complete</w:t>
+              <w:t>lung benign neoplasm</w:t>
+            </w:r>
+          </w:p>
+        </w:tc>
+        <w:tc>
+          <w:tcPr>
+            <w:tcW w:type="dxa" w:w="2160"/>
+          </w:tcPr>
+          <w:p>
+            <w:r>
+              <w:t>1</w:t>
+            </w:r>
+          </w:p>
+        </w:tc>
+        <w:tc>
+          <w:tcPr>
+            <w:tcW w:type="dxa" w:w="2160"/>
+          </w:tcPr>
+          <w:p>
+            <w:r>
+              <w:t>targets SLC22A2 → associated_with → lung benign neoplasm</w:t>
             </w:r>
           </w:p>
         </w:tc>
@@ -836,21 +2455,41 @@
       <w:tr>
         <w:tc>
           <w:tcPr>
-            <w:tcW w:type="dxa" w:w="4320"/>
+            <w:tcW w:type="dxa" w:w="2160"/>
           </w:tcPr>
           <w:p>
             <w:r>
-              <w:t>ProbCBR slices 3–4</w:t>
+              <w:t>tofacitinib</w:t>
             </w:r>
           </w:p>
         </w:tc>
         <w:tc>
           <w:tcPr>
-            <w:tcW w:type="dxa" w:w="4320"/>
+            <w:tcW w:type="dxa" w:w="2160"/>
           </w:tcPr>
           <w:p>
             <w:r>
-              <w:t>In progress</w:t>
+              <w:t>kidney disease</w:t>
+            </w:r>
+          </w:p>
+        </w:tc>
+        <w:tc>
+          <w:tcPr>
+            <w:tcW w:type="dxa" w:w="2160"/>
+          </w:tcPr>
+          <w:p>
+            <w:r>
+              <w:t>1</w:t>
+            </w:r>
+          </w:p>
+        </w:tc>
+        <w:tc>
+          <w:tcPr>
+            <w:tcW w:type="dxa" w:w="2160"/>
+          </w:tcPr>
+          <w:p>
+            <w:r>
+              <w:t>inhibits ABL1 → associated_with → kidney disease</w:t>
             </w:r>
           </w:p>
         </w:tc>
@@ -858,21 +2497,41 @@
       <w:tr>
         <w:tc>
           <w:tcPr>
-            <w:tcW w:type="dxa" w:w="4320"/>
+            <w:tcW w:type="dxa" w:w="2160"/>
           </w:tcPr>
           <w:p>
             <w:r>
-              <w:t>Path-Gated Re-ranking slice_0</w:t>
+              <w:t>everolimus</w:t>
             </w:r>
           </w:p>
         </w:tc>
         <w:tc>
           <w:tcPr>
-            <w:tcW w:type="dxa" w:w="4320"/>
+            <w:tcW w:type="dxa" w:w="2160"/>
           </w:tcPr>
           <w:p>
             <w:r>
-              <w:t>Complete</w:t>
+              <w:t>malignant neoplasm of breast</w:t>
+            </w:r>
+          </w:p>
+        </w:tc>
+        <w:tc>
+          <w:tcPr>
+            <w:tcW w:type="dxa" w:w="2160"/>
+          </w:tcPr>
+          <w:p>
+            <w:r>
+              <w:t>2</w:t>
+            </w:r>
+          </w:p>
+        </w:tc>
+        <w:tc>
+          <w:tcPr>
+            <w:tcW w:type="dxa" w:w="2160"/>
+          </w:tcPr>
+          <w:p>
+            <w:r>
+              <w:t>inhibits CDH1 → associated_with → breast cancer</w:t>
             </w:r>
           </w:p>
         </w:tc>
@@ -880,21 +2539,41 @@
       <w:tr>
         <w:tc>
           <w:tcPr>
-            <w:tcW w:type="dxa" w:w="4320"/>
+            <w:tcW w:type="dxa" w:w="2160"/>
           </w:tcPr>
           <w:p>
             <w:r>
-              <w:t>Simple Ensemble slice_0</w:t>
+              <w:t>frovatriptan</w:t>
             </w:r>
           </w:p>
         </w:tc>
         <w:tc>
           <w:tcPr>
-            <w:tcW w:type="dxa" w:w="4320"/>
+            <w:tcW w:type="dxa" w:w="2160"/>
           </w:tcPr>
           <w:p>
             <w:r>
-              <w:t>Complete</w:t>
+              <w:t>essential tremor</w:t>
+            </w:r>
+          </w:p>
+        </w:tc>
+        <w:tc>
+          <w:tcPr>
+            <w:tcW w:type="dxa" w:w="2160"/>
+          </w:tcPr>
+          <w:p>
+            <w:r>
+              <w:t>1</w:t>
+            </w:r>
+          </w:p>
+        </w:tc>
+        <w:tc>
+          <w:tcPr>
+            <w:tcW w:type="dxa" w:w="2160"/>
+          </w:tcPr>
+          <w:p>
+            <w:r>
+              <w:t>activates HTR1A → associated_with → essential tremor</w:t>
             </w:r>
           </w:p>
         </w:tc>

</xml_diff>